<commit_message>
Refine WeChat article opening
</commit_message>
<xml_diff>
--- a/content/wechat/foundation-models-and-inference/submodules/llm/推文终稿/大话大语言模型-它为什么能一句接一句-公众号橙色排版.docx
+++ b/content/wechat/foundation-models-and-inference/submodules/llm/推文终稿/大话大语言模型-它为什么能一句接一句-公众号橙色排版.docx
@@ -12,9 +12,9 @@
           <w:rFonts w:ascii="Hiragino Sans GB" w:hAnsi="Hiragino Sans GB" w:eastAsia="Hiragino Sans GB"/>
           <w:b/>
           <w:color w:val="20252B"/>
-          <w:sz w:val="48"/>
+          <w:sz w:val="37"/>
         </w:rPr>
-        <w:t>大话大语言模型：它为什么能一句接一句</w:t>
+        <w:t>大话大语言模型—它为什么能一句接一句</w:t>
       </w:r>
     </w:p>
     <w:p>
@@ -24,56 +24,10 @@
       <w:r>
         <w:rPr>
           <w:rFonts w:ascii="Hiragino Sans GB" w:hAnsi="Hiragino Sans GB" w:eastAsia="Hiragino Sans GB"/>
-          <w:color w:val="C85D12"/>
+          <w:color w:val="888888"/>
           <w:sz w:val="21"/>
         </w:rPr>
-        <w:t>作者：三色堇絮絮念</w:t>
-      </w:r>
-    </w:p>
-    <w:p>
-      <w:pPr>
-        <w:pStyle w:val="ArticleDigest"/>
-      </w:pPr>
-      <w:r>
-        <w:rPr>
-          <w:rFonts w:ascii="Hiragino Sans GB" w:hAnsi="Hiragino Sans GB" w:eastAsia="Hiragino Sans GB"/>
-          <w:color w:val="595959"/>
-          <w:sz w:val="21"/>
-        </w:rPr>
-        <w:t>借一条会议改期通知，看懂 token、注意力、上下文、采样，以及模型什么时候会写得像却写不对。</w:t>
-      </w:r>
-    </w:p>
-    <w:p>
-      <w:pPr>
-        <w:widowControl/>
-        <w:spacing w:before="0" w:after="180" w:line="420" w:lineRule="auto"/>
-        <w:jc w:val="both"/>
-      </w:pPr>
-      <w:r>
-        <w:rPr>
-          <w:rFonts w:ascii="Hiragino Sans GB" w:hAnsi="Hiragino Sans GB" w:eastAsia="Hiragino Sans GB"/>
-          <w:sz w:val="22"/>
-        </w:rPr>
-        <w:t>项目入口：</w:t>
-      </w:r>
-      <w:hyperlink r:id="rId9">
-        <w:r>
-          <w:rPr>
-            <w:color w:val="C85D12"/>
-            <w:u w:val="single"/>
-            <w:rFonts w:ascii="Hiragino Sans GB" w:hAnsi="Hiragino Sans GB" w:eastAsia="Hiragino Sans GB"/>
-            <w:sz w:val="22"/>
-            <w:szCs w:val="22"/>
-          </w:rPr>
-          <w:t>AI Agent 知识图谱仓库</w:t>
-        </w:r>
-      </w:hyperlink>
-      <w:r>
-        <w:rPr>
-          <w:rFonts w:ascii="Hiragino Sans GB" w:hAnsi="Hiragino Sans GB" w:eastAsia="Hiragino Sans GB"/>
-          <w:sz w:val="22"/>
-        </w:rPr>
-        <w:t>。项目按总览、初学者图解和面试题组织内容；本篇聚焦大语言模型怎样生成与核对文字。</w:t>
+        <w:t>原创：三色堇</w:t>
       </w:r>
     </w:p>
     <w:p>
@@ -231,7 +185,7 @@
                     <pic:cNvPicPr/>
                   </pic:nvPicPr>
                   <pic:blipFill>
-                    <a:blip r:embed="rId10"/>
+                    <a:blip r:embed="rId9"/>
                     <a:stretch>
                       <a:fillRect/>
                     </a:stretch>
@@ -534,7 +488,7 @@
                     <pic:cNvPicPr/>
                   </pic:nvPicPr>
                   <pic:blipFill>
-                    <a:blip r:embed="rId11"/>
+                    <a:blip r:embed="rId10"/>
                     <a:stretch>
                       <a:fillRect/>
                     </a:stretch>
@@ -620,7 +574,7 @@
                     <pic:cNvPicPr/>
                   </pic:nvPicPr>
                   <pic:blipFill>
-                    <a:blip r:embed="rId12"/>
+                    <a:blip r:embed="rId11"/>
                     <a:stretch>
                       <a:fillRect/>
                     </a:stretch>
@@ -956,7 +910,7 @@
                     <pic:cNvPicPr/>
                   </pic:nvPicPr>
                   <pic:blipFill>
-                    <a:blip r:embed="rId13"/>
+                    <a:blip r:embed="rId12"/>
                     <a:stretch>
                       <a:fillRect/>
                     </a:stretch>
@@ -1068,7 +1022,7 @@
                     <pic:cNvPicPr/>
                   </pic:nvPicPr>
                   <pic:blipFill>
-                    <a:blip r:embed="rId14"/>
+                    <a:blip r:embed="rId13"/>
                     <a:stretch>
                       <a:fillRect/>
                     </a:stretch>
@@ -1812,7 +1766,7 @@
         </w:rPr>
         <w:t xml:space="preserve">想看它在 AI Agent 中的位置，可回到 </w:t>
       </w:r>
-      <w:hyperlink r:id="rId9">
+      <w:hyperlink r:id="rId14">
         <w:r>
           <w:rPr>
             <w:color w:val="C85D12"/>

</xml_diff>

<commit_message>
Refine WeChat article ending
</commit_message>
<xml_diff>
--- a/content/wechat/foundation-models-and-inference/submodules/llm/推文终稿/大话大语言模型-它为什么能一句接一句-公众号橙色排版.docx
+++ b/content/wechat/foundation-models-and-inference/submodules/llm/推文终稿/大话大语言模型-它为什么能一句接一句-公众号橙色排版.docx
@@ -1755,39 +1755,6 @@
     </w:p>
     <w:p>
       <w:pPr>
-        <w:widowControl/>
-        <w:spacing w:before="0" w:after="180" w:line="420" w:lineRule="auto"/>
-        <w:jc w:val="both"/>
-      </w:pPr>
-      <w:r>
-        <w:rPr>
-          <w:rFonts w:ascii="Hiragino Sans GB" w:hAnsi="Hiragino Sans GB" w:eastAsia="Hiragino Sans GB"/>
-          <w:sz w:val="22"/>
-        </w:rPr>
-        <w:t xml:space="preserve">想看它在 AI Agent 中的位置，可回到 </w:t>
-      </w:r>
-      <w:hyperlink r:id="rId14">
-        <w:r>
-          <w:rPr>
-            <w:color w:val="C85D12"/>
-            <w:u w:val="single"/>
-            <w:rFonts w:ascii="Hiragino Sans GB" w:hAnsi="Hiragino Sans GB" w:eastAsia="Hiragino Sans GB"/>
-            <w:sz w:val="22"/>
-            <w:szCs w:val="22"/>
-          </w:rPr>
-          <w:t>项目总览仓库</w:t>
-        </w:r>
-      </w:hyperlink>
-      <w:r>
-        <w:rPr>
-          <w:rFonts w:ascii="Hiragino Sans GB" w:hAnsi="Hiragino Sans GB" w:eastAsia="Hiragino Sans GB"/>
-          <w:sz w:val="22"/>
-        </w:rPr>
-        <w:t>，从“基础模型与推理”继续阅读。</w:t>
-      </w:r>
-    </w:p>
-    <w:p>
-      <w:pPr>
         <w:pStyle w:val="Heading2"/>
       </w:pPr>
       <w:r>
@@ -1814,7 +1781,7 @@
         </w:rPr>
         <w:t xml:space="preserve">• </w:t>
       </w:r>
-      <w:hyperlink r:id="rId15">
+      <w:hyperlink r:id="rId14">
         <w:r>
           <w:rPr>
             <w:color w:val="C85D12"/>
@@ -1841,7 +1808,7 @@
         </w:rPr>
         <w:t xml:space="preserve">• </w:t>
       </w:r>
-      <w:hyperlink r:id="rId16">
+      <w:hyperlink r:id="rId15">
         <w:r>
           <w:rPr>
             <w:color w:val="C85D12"/>
@@ -1868,7 +1835,7 @@
         </w:rPr>
         <w:t xml:space="preserve">• </w:t>
       </w:r>
-      <w:hyperlink r:id="rId17">
+      <w:hyperlink r:id="rId16">
         <w:r>
           <w:rPr>
             <w:color w:val="C85D12"/>
@@ -1895,7 +1862,7 @@
         </w:rPr>
         <w:t xml:space="preserve">• </w:t>
       </w:r>
-      <w:hyperlink r:id="rId18">
+      <w:hyperlink r:id="rId17">
         <w:r>
           <w:rPr>
             <w:color w:val="C85D12"/>
@@ -1907,6 +1874,39 @@
           <w:t>Efficient Memory Management for Large Language Model Serving with PagedAttention</w:t>
         </w:r>
       </w:hyperlink>
+    </w:p>
+    <w:p>
+      <w:pPr>
+        <w:widowControl/>
+        <w:spacing w:before="260" w:after="0" w:line="420" w:lineRule="auto"/>
+        <w:jc w:val="both"/>
+      </w:pPr>
+      <w:r>
+        <w:rPr>
+          <w:rFonts w:ascii="Hiragino Sans GB" w:hAnsi="Hiragino Sans GB" w:eastAsia="Hiragino Sans GB"/>
+          <w:sz w:val="22"/>
+        </w:rPr>
+        <w:t xml:space="preserve">想看本文在 AI Agent 中的位置，可点击下方 </w:t>
+      </w:r>
+      <w:hyperlink r:id="rId18">
+        <w:r>
+          <w:rPr>
+            <w:color w:val="C85D12"/>
+            <w:u w:val="single"/>
+            <w:rFonts w:ascii="Hiragino Sans GB" w:hAnsi="Hiragino Sans GB" w:eastAsia="Hiragino Sans GB"/>
+            <w:sz w:val="22"/>
+            <w:szCs w:val="22"/>
+          </w:rPr>
+          <w:t>阅读原文</w:t>
+        </w:r>
+      </w:hyperlink>
+      <w:r>
+        <w:rPr>
+          <w:rFonts w:ascii="Hiragino Sans GB" w:hAnsi="Hiragino Sans GB" w:eastAsia="Hiragino Sans GB"/>
+          <w:sz w:val="22"/>
+        </w:rPr>
+        <w:t>，从“基础模型与推理”继续阅读。</w:t>
+      </w:r>
     </w:p>
     <w:sectPr>
       <w:pgSz w:w="12240" w:h="15840"/>

</xml_diff>